<commit_message>
pricing js + docx template
</commit_message>
<xml_diff>
--- a/src/templates/Angebot.docx
+++ b/src/templates/Angebot.docx
@@ -622,14 +622,12 @@
         </w:rPr>
         <w:t>{</w:t>
       </w:r>
-      <w:proofErr w:type="spellStart"/>
       <w:r>
         <w:rPr>
           <w:rFonts w:ascii="Open Sans" w:eastAsia="Open Sans" w:hAnsi="Open Sans" w:cs="Open Sans"/>
         </w:rPr>
         <w:t>Greeting</w:t>
       </w:r>
-      <w:proofErr w:type="spellEnd"/>
       <w:r>
         <w:rPr>
           <w:rFonts w:ascii="Open Sans" w:eastAsia="Open Sans" w:hAnsi="Open Sans" w:cs="Open Sans"/>
@@ -978,19 +976,8 @@
                 <w:sz w:val="20"/>
                 <w:szCs w:val="20"/>
               </w:rPr>
-              <w:t xml:space="preserve">1 </w:t>
-            </w:r>
-            <w:proofErr w:type="spellStart"/>
-            <w:r>
-              <w:rPr>
-                <w:rFonts w:ascii="Open Sans" w:eastAsia="Open Sans" w:hAnsi="Open Sans" w:cs="Open Sans"/>
-                <w:color w:val="070707"/>
-                <w:sz w:val="20"/>
-                <w:szCs w:val="20"/>
-              </w:rPr>
-              <w:t>Stk</w:t>
-            </w:r>
-            <w:proofErr w:type="spellEnd"/>
+              <w:t>1 Stk</w:t>
+            </w:r>
           </w:p>
         </w:tc>
         <w:tc>
@@ -1062,25 +1049,7 @@
                 <w:sz w:val="20"/>
                 <w:szCs w:val="20"/>
               </w:rPr>
-              <w:t>{</w:t>
-            </w:r>
-            <w:proofErr w:type="spellStart"/>
-            <w:r>
-              <w:rPr>
-                <w:rFonts w:ascii="Open Sans" w:eastAsia="Open Sans" w:hAnsi="Open Sans" w:cs="Open Sans"/>
-                <w:sz w:val="20"/>
-                <w:szCs w:val="20"/>
-              </w:rPr>
-              <w:t>ServiceUnitPrice</w:t>
-            </w:r>
-            <w:proofErr w:type="spellEnd"/>
-            <w:r>
-              <w:rPr>
-                <w:rFonts w:ascii="Open Sans" w:eastAsia="Open Sans" w:hAnsi="Open Sans" w:cs="Open Sans"/>
-                <w:sz w:val="20"/>
-                <w:szCs w:val="20"/>
-              </w:rPr>
-              <w:t>}</w:t>
+              <w:t>{ServiceUnitPrice}</w:t>
             </w:r>
           </w:p>
         </w:tc>
@@ -1115,25 +1084,7 @@
                 <w:sz w:val="20"/>
                 <w:szCs w:val="20"/>
               </w:rPr>
-              <w:t>{</w:t>
-            </w:r>
-            <w:proofErr w:type="spellStart"/>
-            <w:r>
-              <w:rPr>
-                <w:rFonts w:ascii="Open Sans" w:eastAsia="Open Sans" w:hAnsi="Open Sans" w:cs="Open Sans"/>
-                <w:sz w:val="20"/>
-                <w:szCs w:val="20"/>
-              </w:rPr>
-              <w:t>ServiceTotal</w:t>
-            </w:r>
-            <w:proofErr w:type="spellEnd"/>
-            <w:r>
-              <w:rPr>
-                <w:rFonts w:ascii="Open Sans" w:eastAsia="Open Sans" w:hAnsi="Open Sans" w:cs="Open Sans"/>
-                <w:sz w:val="20"/>
-                <w:szCs w:val="20"/>
-              </w:rPr>
-              <w:t>}</w:t>
+              <w:t>{ServiceTotal}</w:t>
             </w:r>
           </w:p>
         </w:tc>
@@ -1237,25 +1188,7 @@
                 <w:sz w:val="20"/>
                 <w:szCs w:val="20"/>
               </w:rPr>
-              <w:t>{</w:t>
-            </w:r>
-            <w:proofErr w:type="spellStart"/>
-            <w:r>
-              <w:rPr>
-                <w:rFonts w:ascii="Open Sans" w:eastAsia="Open Sans" w:hAnsi="Open Sans" w:cs="Open Sans"/>
-                <w:sz w:val="20"/>
-                <w:szCs w:val="20"/>
-              </w:rPr>
-              <w:t>ServicePosTitle</w:t>
-            </w:r>
-            <w:proofErr w:type="spellEnd"/>
-            <w:r>
-              <w:rPr>
-                <w:rFonts w:ascii="Open Sans" w:eastAsia="Open Sans" w:hAnsi="Open Sans" w:cs="Open Sans"/>
-                <w:sz w:val="20"/>
-                <w:szCs w:val="20"/>
-              </w:rPr>
-              <w:t>}</w:t>
+              <w:t>{ServicePosTitle}</w:t>
             </w:r>
           </w:p>
         </w:tc>
@@ -1439,62 +1372,26 @@
                 <w:sz w:val="18"/>
                 <w:szCs w:val="18"/>
               </w:rPr>
-              <w:t>{</w:t>
-            </w:r>
-            <w:proofErr w:type="spellStart"/>
-            <w:r>
+              <w:t>{ServiceLine}</w:t>
+            </w:r>
+          </w:p>
+          <w:p>
+            <w:pPr>
+              <w:spacing w:line="278" w:lineRule="auto"/>
+              <w:ind w:right="314"/>
               <w:rPr>
                 <w:rFonts w:ascii="Open Sans" w:eastAsia="Open Sans" w:hAnsi="Open Sans" w:cs="Open Sans"/>
                 <w:sz w:val="18"/>
                 <w:szCs w:val="18"/>
               </w:rPr>
-              <w:t>ServiceLine</w:t>
-            </w:r>
-            <w:proofErr w:type="spellEnd"/>
+            </w:pPr>
             <w:r>
               <w:rPr>
                 <w:rFonts w:ascii="Open Sans" w:eastAsia="Open Sans" w:hAnsi="Open Sans" w:cs="Open Sans"/>
                 <w:sz w:val="18"/>
                 <w:szCs w:val="18"/>
               </w:rPr>
-              <w:t>}</w:t>
-            </w:r>
-          </w:p>
-          <w:p>
-            <w:pPr>
-              <w:spacing w:line="278" w:lineRule="auto"/>
-              <w:ind w:right="314"/>
-              <w:rPr>
-                <w:rFonts w:ascii="Open Sans" w:eastAsia="Open Sans" w:hAnsi="Open Sans" w:cs="Open Sans"/>
-                <w:sz w:val="18"/>
-                <w:szCs w:val="18"/>
-              </w:rPr>
-            </w:pPr>
-            <w:r>
-              <w:rPr>
-                <w:rFonts w:ascii="Open Sans" w:eastAsia="Open Sans" w:hAnsi="Open Sans" w:cs="Open Sans"/>
-                <w:sz w:val="18"/>
-                <w:szCs w:val="18"/>
-              </w:rPr>
-              <w:t>{/</w:t>
-            </w:r>
-            <w:proofErr w:type="spellStart"/>
-            <w:r>
-              <w:rPr>
-                <w:rFonts w:ascii="Open Sans" w:eastAsia="Open Sans" w:hAnsi="Open Sans" w:cs="Open Sans"/>
-                <w:sz w:val="18"/>
-                <w:szCs w:val="18"/>
-              </w:rPr>
-              <w:t>ServiceLines</w:t>
-            </w:r>
-            <w:proofErr w:type="spellEnd"/>
-            <w:r>
-              <w:rPr>
-                <w:rFonts w:ascii="Open Sans" w:eastAsia="Open Sans" w:hAnsi="Open Sans" w:cs="Open Sans"/>
-                <w:sz w:val="18"/>
-                <w:szCs w:val="18"/>
-              </w:rPr>
-              <w:t>}</w:t>
+              <w:t>{/ServiceLines}</w:t>
             </w:r>
           </w:p>
         </w:tc>
@@ -1593,8 +1490,8 @@
       <w:tblGrid>
         <w:gridCol w:w="660"/>
         <w:gridCol w:w="1035"/>
-        <w:gridCol w:w="4674"/>
-        <w:gridCol w:w="1701"/>
+        <w:gridCol w:w="4107"/>
+        <w:gridCol w:w="2268"/>
         <w:gridCol w:w="1710"/>
       </w:tblGrid>
       <w:tr>
@@ -1668,7 +1565,7 @@
         </w:tc>
         <w:tc>
           <w:tcPr>
-            <w:tcW w:w="4674" w:type="dxa"/>
+            <w:tcW w:w="4107" w:type="dxa"/>
             <w:tcBorders>
               <w:bottom w:val="single" w:sz="8" w:space="0" w:color="FFFFFF"/>
             </w:tcBorders>
@@ -1703,7 +1600,7 @@
         </w:tc>
         <w:tc>
           <w:tcPr>
-            <w:tcW w:w="1701" w:type="dxa"/>
+            <w:tcW w:w="2268" w:type="dxa"/>
             <w:tcBorders>
               <w:bottom w:val="single" w:sz="8" w:space="0" w:color="FFFFFF"/>
             </w:tcBorders>
@@ -1844,24 +1741,13 @@
                 <w:sz w:val="20"/>
                 <w:szCs w:val="20"/>
               </w:rPr>
-              <w:t xml:space="preserve">1 </w:t>
-            </w:r>
-            <w:proofErr w:type="spellStart"/>
-            <w:r>
-              <w:rPr>
-                <w:rFonts w:ascii="Open Sans" w:eastAsia="Open Sans" w:hAnsi="Open Sans" w:cs="Open Sans"/>
-                <w:color w:val="070707"/>
-                <w:sz w:val="20"/>
-                <w:szCs w:val="20"/>
-              </w:rPr>
-              <w:t>Stk</w:t>
-            </w:r>
-            <w:proofErr w:type="spellEnd"/>
+              <w:t>1 Stk</w:t>
+            </w:r>
           </w:p>
         </w:tc>
         <w:tc>
           <w:tcPr>
-            <w:tcW w:w="4674" w:type="dxa"/>
+            <w:tcW w:w="4107" w:type="dxa"/>
             <w:tcBorders>
               <w:top w:val="single" w:sz="8" w:space="0" w:color="FFFFFF"/>
               <w:left w:val="single" w:sz="8" w:space="0" w:color="FFFFFF"/>
@@ -1899,7 +1785,7 @@
         </w:tc>
         <w:tc>
           <w:tcPr>
-            <w:tcW w:w="1701" w:type="dxa"/>
+            <w:tcW w:w="2268" w:type="dxa"/>
             <w:tcBorders>
               <w:top w:val="single" w:sz="8" w:space="0" w:color="FFFFFF"/>
               <w:left w:val="single" w:sz="8" w:space="0" w:color="FFFFFF"/>
@@ -1928,7 +1814,7 @@
                 <w:sz w:val="20"/>
                 <w:szCs w:val="20"/>
               </w:rPr>
-              <w:t>{Material}</w:t>
+              <w:t>{MaterialsUnitPrice}</w:t>
             </w:r>
           </w:p>
         </w:tc>
@@ -1964,7 +1850,7 @@
                 <w:sz w:val="20"/>
                 <w:szCs w:val="20"/>
               </w:rPr>
-              <w:t>{Material}</w:t>
+              <w:t>{MaterialsTotal}</w:t>
             </w:r>
           </w:p>
         </w:tc>
@@ -2026,7 +1912,7 @@
         </w:tc>
         <w:tc>
           <w:tcPr>
-            <w:tcW w:w="4674" w:type="dxa"/>
+            <w:tcW w:w="4107" w:type="dxa"/>
             <w:tcBorders>
               <w:top w:val="single" w:sz="8" w:space="0" w:color="FFFFFF"/>
               <w:left w:val="single" w:sz="8" w:space="0" w:color="FFFFFF"/>
@@ -2056,13 +1942,13 @@
                 <w:sz w:val="20"/>
                 <w:szCs w:val="20"/>
               </w:rPr>
-              <w:t>{Long}</w:t>
+              <w:t>{MaterialsPosTitle}</w:t>
             </w:r>
           </w:p>
         </w:tc>
         <w:tc>
           <w:tcPr>
-            <w:tcW w:w="1701" w:type="dxa"/>
+            <w:tcW w:w="2268" w:type="dxa"/>
             <w:tcBorders>
               <w:top w:val="single" w:sz="8" w:space="0" w:color="FFFFFF"/>
               <w:left w:val="single" w:sz="8" w:space="0" w:color="FFFFFF"/>
@@ -2139,22 +2025,13 @@
           </w:tcPr>
           <w:p>
             <w:pPr>
-              <w:spacing w:line="278" w:lineRule="auto"/>
-              <w:ind w:right="-26"/>
-              <w:rPr>
-                <w:rFonts w:ascii="Open Sans" w:eastAsia="Open Sans" w:hAnsi="Open Sans" w:cs="Open Sans"/>
-                <w:sz w:val="20"/>
-                <w:szCs w:val="20"/>
-              </w:rPr>
-            </w:pPr>
-            <w:r>
-              <w:rPr>
-                <w:rFonts w:ascii="Open Sans" w:eastAsia="Open Sans" w:hAnsi="Open Sans" w:cs="Open Sans"/>
-                <w:sz w:val="20"/>
-                <w:szCs w:val="20"/>
-              </w:rPr>
-              <w:t>{Pos003}</w:t>
-            </w:r>
+              <w:rPr>
+                <w:rFonts w:ascii="Open Sans" w:eastAsia="Open Sans" w:hAnsi="Open Sans" w:cs="Open Sans"/>
+                <w:color w:val="070707"/>
+                <w:sz w:val="24"/>
+                <w:szCs w:val="24"/>
+              </w:rPr>
+            </w:pPr>
           </w:p>
         </w:tc>
         <w:tc>
@@ -2175,27 +2052,18 @@
           </w:tcPr>
           <w:p>
             <w:pPr>
-              <w:spacing w:line="278" w:lineRule="auto"/>
-              <w:ind w:right="314"/>
-              <w:rPr>
-                <w:rFonts w:ascii="Open Sans" w:eastAsia="Open Sans" w:hAnsi="Open Sans" w:cs="Open Sans"/>
-                <w:sz w:val="20"/>
-                <w:szCs w:val="20"/>
-              </w:rPr>
-            </w:pPr>
-            <w:r>
-              <w:rPr>
-                <w:rFonts w:ascii="Open Sans" w:eastAsia="Open Sans" w:hAnsi="Open Sans" w:cs="Open Sans"/>
-                <w:sz w:val="20"/>
-                <w:szCs w:val="20"/>
-              </w:rPr>
-              <w:t>{Bonus1Stk}</w:t>
-            </w:r>
+              <w:rPr>
+                <w:rFonts w:ascii="Open Sans" w:eastAsia="Open Sans" w:hAnsi="Open Sans" w:cs="Open Sans"/>
+                <w:color w:val="070707"/>
+                <w:sz w:val="24"/>
+                <w:szCs w:val="24"/>
+              </w:rPr>
+            </w:pPr>
           </w:p>
         </w:tc>
         <w:tc>
           <w:tcPr>
-            <w:tcW w:w="4674" w:type="dxa"/>
+            <w:tcW w:w="4107" w:type="dxa"/>
             <w:tcBorders>
               <w:top w:val="single" w:sz="8" w:space="0" w:color="FFFFFF"/>
               <w:left w:val="single" w:sz="8" w:space="0" w:color="FFFFFF"/>
@@ -2225,13 +2093,51 @@
                 <w:sz w:val="20"/>
                 <w:szCs w:val="20"/>
               </w:rPr>
-              <w:t>{Bonus1}</w:t>
+              <w:t>{#MaterialsLines}</w:t>
+            </w:r>
+          </w:p>
+          <w:p>
+            <w:pPr>
+              <w:spacing w:line="278" w:lineRule="auto"/>
+              <w:ind w:right="314"/>
+              <w:rPr>
+                <w:rFonts w:ascii="Open Sans" w:eastAsia="Open Sans" w:hAnsi="Open Sans" w:cs="Open Sans"/>
+                <w:sz w:val="20"/>
+                <w:szCs w:val="20"/>
+              </w:rPr>
+            </w:pPr>
+            <w:r>
+              <w:rPr>
+                <w:rFonts w:ascii="Open Sans" w:eastAsia="Open Sans" w:hAnsi="Open Sans" w:cs="Open Sans"/>
+                <w:sz w:val="20"/>
+                <w:szCs w:val="20"/>
+              </w:rPr>
+              <w:t>{MaterialLine}</w:t>
+            </w:r>
+          </w:p>
+          <w:p>
+            <w:pPr>
+              <w:spacing w:line="278" w:lineRule="auto"/>
+              <w:ind w:right="314"/>
+              <w:rPr>
+                <w:rFonts w:ascii="Open Sans" w:eastAsia="Open Sans" w:hAnsi="Open Sans" w:cs="Open Sans"/>
+                <w:sz w:val="20"/>
+                <w:szCs w:val="20"/>
+              </w:rPr>
+            </w:pPr>
+            <w:r>
+              <w:rPr>
+                <w:rFonts w:ascii="Open Sans" w:eastAsia="Open Sans" w:hAnsi="Open Sans" w:cs="Open Sans"/>
+                <w:sz w:val="20"/>
+                <w:szCs w:val="20"/>
+              </w:rPr>
+              <w:t>{/MaterialsLines}</w:t>
             </w:r>
           </w:p>
         </w:tc>
         <w:tc>
           <w:tcPr>
-            <w:tcW w:w="1701" w:type="dxa"/>
+            <w:tcW w:w="2268" w:type="dxa"/>
             <w:tcBorders>
               <w:top w:val="single" w:sz="8" w:space="0" w:color="FFFFFF"/>
               <w:left w:val="single" w:sz="8" w:space="0" w:color="FFFFFF"/>
@@ -2249,20 +2155,13 @@
             <w:pPr>
               <w:spacing w:line="278" w:lineRule="auto"/>
               <w:ind w:right="314"/>
+              <w:jc w:val="right"/>
               <w:rPr>
                 <w:rFonts w:ascii="Open Sans" w:eastAsia="Open Sans" w:hAnsi="Open Sans" w:cs="Open Sans"/>
                 <w:sz w:val="24"/>
                 <w:szCs w:val="24"/>
               </w:rPr>
             </w:pPr>
-            <w:r>
-              <w:rPr>
-                <w:rFonts w:ascii="Open Sans" w:eastAsia="Open Sans" w:hAnsi="Open Sans" w:cs="Open Sans"/>
-                <w:sz w:val="20"/>
-                <w:szCs w:val="20"/>
-              </w:rPr>
-              <w:t>{Bonus1Price}</w:t>
-            </w:r>
           </w:p>
         </w:tc>
         <w:tc>
@@ -2280,25 +2179,19 @@
               <w:bottom w:w="56" w:type="dxa"/>
               <w:right w:w="56" w:type="dxa"/>
             </w:tcMar>
+            <w:vAlign w:val="center"/>
           </w:tcPr>
           <w:p>
             <w:pPr>
               <w:spacing w:line="278" w:lineRule="auto"/>
               <w:ind w:right="314"/>
+              <w:jc w:val="right"/>
               <w:rPr>
                 <w:rFonts w:ascii="Open Sans" w:eastAsia="Open Sans" w:hAnsi="Open Sans" w:cs="Open Sans"/>
                 <w:sz w:val="24"/>
                 <w:szCs w:val="24"/>
               </w:rPr>
             </w:pPr>
-            <w:r>
-              <w:rPr>
-                <w:rFonts w:ascii="Open Sans" w:eastAsia="Open Sans" w:hAnsi="Open Sans" w:cs="Open Sans"/>
-                <w:sz w:val="20"/>
-                <w:szCs w:val="20"/>
-              </w:rPr>
-              <w:t>{Bonus1Price}</w:t>
-            </w:r>
           </w:p>
         </w:tc>
       </w:tr>
@@ -2335,7 +2228,7 @@
                 <w:sz w:val="20"/>
                 <w:szCs w:val="20"/>
               </w:rPr>
-              <w:t>{Pos004}</w:t>
+              <w:t>{Pos003}</w:t>
             </w:r>
           </w:p>
         </w:tc>
@@ -2371,13 +2264,13 @@
                 <w:sz w:val="20"/>
                 <w:szCs w:val="20"/>
               </w:rPr>
-              <w:t>{Bonus2Stk}</w:t>
+              <w:t>{Bonus1Stk}</w:t>
             </w:r>
           </w:p>
         </w:tc>
         <w:tc>
           <w:tcPr>
-            <w:tcW w:w="4674" w:type="dxa"/>
+            <w:tcW w:w="4107" w:type="dxa"/>
             <w:tcBorders>
               <w:top w:val="single" w:sz="8" w:space="0" w:color="FFFFFF"/>
               <w:left w:val="single" w:sz="8" w:space="0" w:color="FFFFFF"/>
@@ -2407,13 +2300,195 @@
                 <w:sz w:val="20"/>
                 <w:szCs w:val="20"/>
               </w:rPr>
-              <w:t>{Bonus2}</w:t>
+              <w:t>{Bonus1}</w:t>
             </w:r>
           </w:p>
         </w:tc>
         <w:tc>
           <w:tcPr>
-            <w:tcW w:w="1701" w:type="dxa"/>
+            <w:tcW w:w="2268" w:type="dxa"/>
+            <w:tcBorders>
+              <w:top w:val="single" w:sz="8" w:space="0" w:color="FFFFFF"/>
+              <w:left w:val="single" w:sz="8" w:space="0" w:color="FFFFFF"/>
+              <w:bottom w:val="single" w:sz="8" w:space="0" w:color="FFFFFF"/>
+              <w:right w:val="single" w:sz="8" w:space="0" w:color="FFFFFF"/>
+            </w:tcBorders>
+            <w:tcMar>
+              <w:top w:w="56" w:type="dxa"/>
+              <w:left w:w="56" w:type="dxa"/>
+              <w:bottom w:w="56" w:type="dxa"/>
+              <w:right w:w="56" w:type="dxa"/>
+            </w:tcMar>
+          </w:tcPr>
+          <w:p>
+            <w:pPr>
+              <w:spacing w:line="278" w:lineRule="auto"/>
+              <w:ind w:right="314"/>
+              <w:rPr>
+                <w:rFonts w:ascii="Open Sans" w:eastAsia="Open Sans" w:hAnsi="Open Sans" w:cs="Open Sans"/>
+                <w:sz w:val="24"/>
+                <w:szCs w:val="24"/>
+              </w:rPr>
+            </w:pPr>
+            <w:r>
+              <w:rPr>
+                <w:rFonts w:ascii="Open Sans" w:eastAsia="Open Sans" w:hAnsi="Open Sans" w:cs="Open Sans"/>
+                <w:sz w:val="20"/>
+                <w:szCs w:val="20"/>
+              </w:rPr>
+              <w:t>{Bonus1Price}</w:t>
+            </w:r>
+          </w:p>
+        </w:tc>
+        <w:tc>
+          <w:tcPr>
+            <w:tcW w:w="1710" w:type="dxa"/>
+            <w:tcBorders>
+              <w:top w:val="single" w:sz="8" w:space="0" w:color="FFFFFF"/>
+              <w:left w:val="single" w:sz="8" w:space="0" w:color="FFFFFF"/>
+              <w:bottom w:val="single" w:sz="8" w:space="0" w:color="FFFFFF"/>
+              <w:right w:val="single" w:sz="8" w:space="0" w:color="FFFFFF"/>
+            </w:tcBorders>
+            <w:tcMar>
+              <w:top w:w="56" w:type="dxa"/>
+              <w:left w:w="56" w:type="dxa"/>
+              <w:bottom w:w="56" w:type="dxa"/>
+              <w:right w:w="56" w:type="dxa"/>
+            </w:tcMar>
+          </w:tcPr>
+          <w:p>
+            <w:pPr>
+              <w:spacing w:line="278" w:lineRule="auto"/>
+              <w:ind w:right="314"/>
+              <w:rPr>
+                <w:rFonts w:ascii="Open Sans" w:eastAsia="Open Sans" w:hAnsi="Open Sans" w:cs="Open Sans"/>
+                <w:sz w:val="24"/>
+                <w:szCs w:val="24"/>
+              </w:rPr>
+            </w:pPr>
+            <w:r>
+              <w:rPr>
+                <w:rFonts w:ascii="Open Sans" w:eastAsia="Open Sans" w:hAnsi="Open Sans" w:cs="Open Sans"/>
+                <w:sz w:val="20"/>
+                <w:szCs w:val="20"/>
+              </w:rPr>
+              <w:t>{Bonus1Price}</w:t>
+            </w:r>
+          </w:p>
+        </w:tc>
+      </w:tr>
+      <w:tr>
+        <w:tc>
+          <w:tcPr>
+            <w:tcW w:w="660" w:type="dxa"/>
+            <w:tcBorders>
+              <w:top w:val="single" w:sz="8" w:space="0" w:color="FFFFFF"/>
+              <w:left w:val="single" w:sz="8" w:space="0" w:color="FFFFFF"/>
+              <w:bottom w:val="single" w:sz="8" w:space="0" w:color="FFFFFF"/>
+              <w:right w:val="single" w:sz="8" w:space="0" w:color="FFFFFF"/>
+            </w:tcBorders>
+            <w:tcMar>
+              <w:top w:w="56" w:type="dxa"/>
+              <w:left w:w="56" w:type="dxa"/>
+              <w:bottom w:w="56" w:type="dxa"/>
+              <w:right w:w="56" w:type="dxa"/>
+            </w:tcMar>
+          </w:tcPr>
+          <w:p>
+            <w:pPr>
+              <w:spacing w:line="278" w:lineRule="auto"/>
+              <w:ind w:right="-26"/>
+              <w:rPr>
+                <w:rFonts w:ascii="Open Sans" w:eastAsia="Open Sans" w:hAnsi="Open Sans" w:cs="Open Sans"/>
+                <w:sz w:val="20"/>
+                <w:szCs w:val="20"/>
+              </w:rPr>
+            </w:pPr>
+            <w:r>
+              <w:rPr>
+                <w:rFonts w:ascii="Open Sans" w:eastAsia="Open Sans" w:hAnsi="Open Sans" w:cs="Open Sans"/>
+                <w:sz w:val="20"/>
+                <w:szCs w:val="20"/>
+              </w:rPr>
+              <w:t>{Pos004}</w:t>
+            </w:r>
+          </w:p>
+        </w:tc>
+        <w:tc>
+          <w:tcPr>
+            <w:tcW w:w="1035" w:type="dxa"/>
+            <w:tcBorders>
+              <w:top w:val="single" w:sz="8" w:space="0" w:color="FFFFFF"/>
+              <w:left w:val="single" w:sz="8" w:space="0" w:color="FFFFFF"/>
+              <w:bottom w:val="single" w:sz="8" w:space="0" w:color="FFFFFF"/>
+              <w:right w:val="single" w:sz="8" w:space="0" w:color="FFFFFF"/>
+            </w:tcBorders>
+            <w:tcMar>
+              <w:top w:w="56" w:type="dxa"/>
+              <w:left w:w="56" w:type="dxa"/>
+              <w:bottom w:w="56" w:type="dxa"/>
+              <w:right w:w="56" w:type="dxa"/>
+            </w:tcMar>
+          </w:tcPr>
+          <w:p>
+            <w:pPr>
+              <w:spacing w:line="278" w:lineRule="auto"/>
+              <w:ind w:right="314"/>
+              <w:rPr>
+                <w:rFonts w:ascii="Open Sans" w:eastAsia="Open Sans" w:hAnsi="Open Sans" w:cs="Open Sans"/>
+                <w:sz w:val="20"/>
+                <w:szCs w:val="20"/>
+              </w:rPr>
+            </w:pPr>
+            <w:r>
+              <w:rPr>
+                <w:rFonts w:ascii="Open Sans" w:eastAsia="Open Sans" w:hAnsi="Open Sans" w:cs="Open Sans"/>
+                <w:sz w:val="20"/>
+                <w:szCs w:val="20"/>
+              </w:rPr>
+              <w:t>{Bonus2Stk}</w:t>
+            </w:r>
+          </w:p>
+        </w:tc>
+        <w:tc>
+          <w:tcPr>
+            <w:tcW w:w="4107" w:type="dxa"/>
+            <w:tcBorders>
+              <w:top w:val="single" w:sz="8" w:space="0" w:color="FFFFFF"/>
+              <w:left w:val="single" w:sz="8" w:space="0" w:color="FFFFFF"/>
+              <w:bottom w:val="single" w:sz="8" w:space="0" w:color="FFFFFF"/>
+              <w:right w:val="single" w:sz="8" w:space="0" w:color="FFFFFF"/>
+            </w:tcBorders>
+            <w:tcMar>
+              <w:top w:w="56" w:type="dxa"/>
+              <w:left w:w="56" w:type="dxa"/>
+              <w:bottom w:w="56" w:type="dxa"/>
+              <w:right w:w="56" w:type="dxa"/>
+            </w:tcMar>
+          </w:tcPr>
+          <w:p>
+            <w:pPr>
+              <w:spacing w:line="278" w:lineRule="auto"/>
+              <w:ind w:right="314"/>
+              <w:rPr>
+                <w:rFonts w:ascii="Open Sans" w:eastAsia="Open Sans" w:hAnsi="Open Sans" w:cs="Open Sans"/>
+                <w:sz w:val="20"/>
+                <w:szCs w:val="20"/>
+              </w:rPr>
+            </w:pPr>
+            <w:r>
+              <w:rPr>
+                <w:rFonts w:ascii="Open Sans" w:eastAsia="Open Sans" w:hAnsi="Open Sans" w:cs="Open Sans"/>
+                <w:sz w:val="20"/>
+                <w:szCs w:val="20"/>
+              </w:rPr>
+              <w:t>{Bonus2}</w:t>
+            </w:r>
+          </w:p>
+        </w:tc>
+        <w:tc>
+          <w:tcPr>
+            <w:tcW w:w="2268" w:type="dxa"/>
             <w:tcBorders>
               <w:top w:val="single" w:sz="8" w:space="0" w:color="FFFFFF"/>
               <w:left w:val="single" w:sz="8" w:space="0" w:color="FFFFFF"/>
@@ -2888,6 +2963,7 @@
                 <w:sz w:val="20"/>
                 <w:szCs w:val="20"/>
               </w:rPr>
+              <w:lastRenderedPageBreak/>
               <w:t>zzgl. 19% MwSt.</w:t>
             </w:r>
           </w:p>
@@ -2997,7 +3073,6 @@
               </w:rPr>
               <w:t>{</w:t>
             </w:r>
-            <w:proofErr w:type="spellStart"/>
             <w:r>
               <w:rPr>
                 <w:rFonts w:ascii="Open Sans Semibold" w:eastAsia="Open Sans Semibold" w:hAnsi="Open Sans Semibold" w:cs="Open Sans Semibold"/>
@@ -3007,7 +3082,6 @@
               </w:rPr>
               <w:t>MwSt</w:t>
             </w:r>
-            <w:proofErr w:type="spellEnd"/>
             <w:r>
               <w:rPr>
                 <w:rFonts w:ascii="Open Sans Semibold" w:eastAsia="Open Sans Semibold" w:hAnsi="Open Sans Semibold" w:cs="Open Sans Semibold"/>
@@ -3321,7 +3395,6 @@
               </w:rPr>
               <w:t>{</w:t>
             </w:r>
-            <w:proofErr w:type="spellStart"/>
             <w:r>
               <w:rPr>
                 <w:rFonts w:ascii="Open Sans Semibold" w:eastAsia="Open Sans Semibold" w:hAnsi="Open Sans Semibold" w:cs="Open Sans Semibold"/>
@@ -3329,19 +3402,8 @@
                 <w:sz w:val="20"/>
                 <w:szCs w:val="20"/>
               </w:rPr>
-              <w:t>Gesamtsummerabat</w:t>
-            </w:r>
-            <w:r>
-              <w:rPr>
-                <w:rFonts w:ascii="Open Sans Semibold" w:eastAsia="Open Sans Semibold" w:hAnsi="Open Sans Semibold" w:cs="Open Sans Semibold"/>
-                <w:color w:val="030303"/>
-                <w:sz w:val="20"/>
-                <w:szCs w:val="20"/>
-              </w:rPr>
-              <w:lastRenderedPageBreak/>
-              <w:t>t</w:t>
-            </w:r>
-            <w:proofErr w:type="spellEnd"/>
+              <w:t>Gesamtsummerabatt</w:t>
+            </w:r>
             <w:r>
               <w:rPr>
                 <w:rFonts w:ascii="Open Sans Semibold" w:eastAsia="Open Sans Semibold" w:hAnsi="Open Sans Semibold" w:cs="Open Sans Semibold"/>
@@ -3468,23 +3530,7 @@
           <w:rFonts w:ascii="Open Sans" w:eastAsia="Open Sans" w:hAnsi="Open Sans" w:cs="Open Sans"/>
           <w:color w:val="030303"/>
         </w:rPr>
-        <w:t xml:space="preserve">Diese werden vorab mit Ihnen besprochen, bedürfen </w:t>
-      </w:r>
-      <w:proofErr w:type="spellStart"/>
-      <w:r>
-        <w:rPr>
-          <w:rFonts w:ascii="Open Sans" w:eastAsia="Open Sans" w:hAnsi="Open Sans" w:cs="Open Sans"/>
-          <w:color w:val="030303"/>
-        </w:rPr>
-        <w:t>lhrer</w:t>
-      </w:r>
-      <w:proofErr w:type="spellEnd"/>
-      <w:r>
-        <w:rPr>
-          <w:rFonts w:ascii="Open Sans" w:eastAsia="Open Sans" w:hAnsi="Open Sans" w:cs="Open Sans"/>
-          <w:color w:val="030303"/>
-        </w:rPr>
-        <w:t xml:space="preserve"> Zustimmung und werden auf Regiebasis nach tatsächlichem Aufwand abgerechnet. (Stundensatz-Facharbeiter: 69,50€ netto)</w:t>
+        <w:t>Diese werden vorab mit Ihnen besprochen, bedürfen lhrer Zustimmung und werden auf Regiebasis nach tatsächlichem Aufwand abgerechnet. (Stundensatz-Facharbeiter: 69,50€ netto)</w:t>
       </w:r>
     </w:p>
     <w:p>
@@ -3533,23 +3579,7 @@
           <w:rFonts w:ascii="Open Sans" w:eastAsia="Open Sans" w:hAnsi="Open Sans" w:cs="Open Sans"/>
           <w:color w:val="030303"/>
         </w:rPr>
-        <w:t xml:space="preserve"> unter Berücksichtigung eines gewährten Zuschusses durch die Pflegekasse </w:t>
-      </w:r>
-      <w:proofErr w:type="spellStart"/>
-      <w:r>
-        <w:rPr>
-          <w:rFonts w:ascii="Open Sans" w:eastAsia="Open Sans" w:hAnsi="Open Sans" w:cs="Open Sans"/>
-          <w:color w:val="030303"/>
-        </w:rPr>
-        <w:t>i.H.v</w:t>
-      </w:r>
-      <w:proofErr w:type="spellEnd"/>
-      <w:r>
-        <w:rPr>
-          <w:rFonts w:ascii="Open Sans" w:eastAsia="Open Sans" w:hAnsi="Open Sans" w:cs="Open Sans"/>
-          <w:color w:val="030303"/>
-        </w:rPr>
-        <w:t xml:space="preserve">. </w:t>
+        <w:t xml:space="preserve"> unter Berücksichtigung eines gewährten Zuschusses durch die Pflegekasse i.H.v. </w:t>
       </w:r>
       <w:r>
         <w:rPr>
@@ -3812,7 +3842,7 @@
               </wp:anchor>
             </w:drawing>
           </mc:Choice>
-          <mc:Fallback xmlns:sl="http://schemas.openxmlformats.org/schemaLibrary/2006/main" xmlns:a="http://schemas.openxmlformats.org/drawingml/2006/main" xmlns:pic="http://schemas.openxmlformats.org/drawingml/2006/picture" xmlns:c="http://schemas.openxmlformats.org/drawingml/2006/chart" xmlns:lc="http://schemas.openxmlformats.org/drawingml/2006/lockedCanvas" xmlns:dgm="http://schemas.openxmlformats.org/drawingml/2006/diagram" xmlns="http://schemas.microsoft.com/office/tasks/2019/documenttasks" xmlns:cr="http://schemas.microsoft.com/office/comments/2020/reactions">
+          <mc:Fallback xmlns:cr="http://schemas.microsoft.com/office/comments/2020/reactions" xmlns="http://schemas.microsoft.com/office/tasks/2019/documenttasks" xmlns:dgm="http://schemas.openxmlformats.org/drawingml/2006/diagram" xmlns:lc="http://schemas.openxmlformats.org/drawingml/2006/lockedCanvas" xmlns:c="http://schemas.openxmlformats.org/drawingml/2006/chart" xmlns:pic="http://schemas.openxmlformats.org/drawingml/2006/picture" xmlns:a="http://schemas.openxmlformats.org/drawingml/2006/main" xmlns:sl="http://schemas.openxmlformats.org/schemaLibrary/2006/main">
             <w:drawing>
               <wp:anchor allowOverlap="1" behindDoc="0" distB="0" distT="0" distL="0" distR="0" hidden="0" layoutInCell="1" locked="0" relativeHeight="0" simplePos="0">
                 <wp:simplePos x="0" y="0"/>
@@ -3973,7 +4003,15 @@
           <w:rFonts w:ascii="Open Sans" w:eastAsia="Open Sans" w:hAnsi="Open Sans" w:cs="Open Sans"/>
           <w:color w:val="030303"/>
         </w:rPr>
-        <w:t>Wir bedanken uns für Ihr Vertrauen und freuen uns, von Ihnen zu hören. Mit freundlichen Grüßen</w:t>
+        <w:t xml:space="preserve">Wir bedanken uns für Ihr Vertrauen und freuen uns, von Ihnen zu hören. Mit </w:t>
+      </w:r>
+      <w:r>
+        <w:rPr>
+          <w:rFonts w:ascii="Open Sans" w:eastAsia="Open Sans" w:hAnsi="Open Sans" w:cs="Open Sans"/>
+          <w:color w:val="030303"/>
+        </w:rPr>
+        <w:lastRenderedPageBreak/>
+        <w:t>freundlichen Grüßen</w:t>
       </w:r>
     </w:p>
     <w:p>
@@ -4103,25 +4141,7 @@
         <w:sz w:val="14"/>
         <w:szCs w:val="14"/>
       </w:rPr>
-      <w:t xml:space="preserve">Steuernummer: 22324320478 | </w:t>
-    </w:r>
-    <w:proofErr w:type="spellStart"/>
-    <w:r>
-      <w:rPr>
-        <w:rFonts w:ascii="Arimo" w:eastAsia="Arimo" w:hAnsi="Arimo" w:cs="Arimo"/>
-        <w:sz w:val="14"/>
-        <w:szCs w:val="14"/>
-      </w:rPr>
-      <w:t>USt-IdNr</w:t>
-    </w:r>
-    <w:proofErr w:type="spellEnd"/>
-    <w:r>
-      <w:rPr>
-        <w:rFonts w:ascii="Arimo" w:eastAsia="Arimo" w:hAnsi="Arimo" w:cs="Arimo"/>
-        <w:sz w:val="14"/>
-        <w:szCs w:val="14"/>
-      </w:rPr>
-      <w:t>.: DE296903997</w:t>
+      <w:t>Steuernummer: 22324320478 | USt-IdNr.: DE296903997</w:t>
     </w:r>
   </w:p>
   <w:p>
@@ -6986,6 +7006,7 @@
   <w:style w:type="character" w:default="1" w:styleId="Domylnaczcionkaakapitu">
     <w:name w:val="Default Paragraph Font"/>
     <w:uiPriority w:val="1"/>
+    <w:semiHidden/>
     <w:unhideWhenUsed/>
   </w:style>
   <w:style w:type="table" w:default="1" w:styleId="Standardowy">

</xml_diff>

<commit_message>
WZD or DZD docx template
</commit_message>
<xml_diff>
--- a/src/templates/Angebot.docx
+++ b/src/templates/Angebot.docx
@@ -1014,7 +1014,16 @@
                 <w:sz w:val="20"/>
                 <w:szCs w:val="20"/>
               </w:rPr>
-              <w:t xml:space="preserve">Auszuführende Arbeiten - Wanne zu Dusche </w:t>
+              <w:t xml:space="preserve">Auszuführende Arbeiten - </w:t>
+            </w:r>
+            <w:r>
+              <w:rPr>
+                <w:rFonts w:ascii="Arimo" w:eastAsia="Arimo" w:hAnsi="Arimo" w:cs="Arimo"/>
+                <w:b/>
+                <w:sz w:val="20"/>
+                <w:szCs w:val="20"/>
+              </w:rPr>
+              <w:t>{OfferType}</w:t>
             </w:r>
           </w:p>
         </w:tc>
@@ -7006,7 +7015,6 @@
   <w:style w:type="character" w:default="1" w:styleId="Domylnaczcionkaakapitu">
     <w:name w:val="Default Paragraph Font"/>
     <w:uiPriority w:val="1"/>
-    <w:semiHidden/>
     <w:unhideWhenUsed/>
   </w:style>
   <w:style w:type="table" w:default="1" w:styleId="Standardowy">

</xml_diff>

<commit_message>
feat(docx): bold + spaced material subcategory headers in Angebot
- mapData: flag each MaterialsLines entry with IsSub (true for the
  KLEINMATERIAL/WANDVERKLEIDUNG/... category header, false for items)
- Angebot.docx: split the {#MaterialsLines} loop's {MaterialLine}
  paragraph into {#IsSub}/{^IsSub} branches — headers render bold with
  spacing before (120 twips), item lines unchanged

Affects the Angebot DOCX/PDF path (Vorschau anzeigen → /api/docx/pdf-preview).

Co-Authored-By: Claude Opus 4.8 <noreply@anthropic.com>
</commit_message>
<xml_diff>
--- a/src/templates/Angebot.docx
+++ b/src/templates/Angebot.docx
@@ -1768,6 +1768,50 @@
             </w:r>
           </w:p>
           <w:p>
+            <w:r>
+              <w:t xml:space="preserve">{#IsSub}</w:t>
+            </w:r>
+          </w:p>
+          <w:p>
+            <w:pPr>
+              <w:pStyle w:val="Normal"/>
+              <w:suppressAutoHyphens w:val="true"/>
+              <w:spacing w:lineRule="auto" w:line="278" w:before="120" w:after="0"/>
+              <w:jc w:val="left"/>
+              <w:rPr>
+                <w:b/>
+                <w:bCs/>
+                <w:rFonts w:ascii="Arial" w:hAnsi="Arial" w:eastAsia="Arial" w:cs="Arial"/>
+                <w:color w:val="000000"/>
+                <w:sz w:val="20"/>
+                <w:szCs w:val="20"/>
+              </w:rPr>
+            </w:pPr>
+            <w:r>
+              <w:rPr>
+                <w:b/>
+                <w:bCs/>
+                <w:rFonts w:eastAsia="Arial" w:cs="Arial" w:ascii="Arial" w:hAnsi="Arial"/>
+                <w:color w:val="000000"/>
+                <w:kern w:val="0"/>
+                <w:sz w:val="20"/>
+                <w:szCs w:val="20"/>
+                <w:lang w:val="pl-PL" w:eastAsia="pl-PL" w:bidi="ar-SA"/>
+              </w:rPr>
+              <w:t>{MaterialLine}</w:t>
+            </w:r>
+          </w:p>
+          <w:p>
+            <w:r>
+              <w:t xml:space="preserve">{/IsSub}</w:t>
+            </w:r>
+          </w:p>
+          <w:p>
+            <w:r>
+              <w:t xml:space="preserve">{^IsSub}</w:t>
+            </w:r>
+          </w:p>
+          <w:p>
             <w:pPr>
               <w:pStyle w:val="Normal"/>
               <w:suppressAutoHyphens w:val="true"/>
@@ -1790,6 +1834,11 @@
                 <w:lang w:val="pl-PL" w:eastAsia="pl-PL" w:bidi="ar-SA"/>
               </w:rPr>
               <w:t>{MaterialLine}</w:t>
+            </w:r>
+          </w:p>
+          <w:p>
+            <w:r>
+              <w:t xml:space="preserve">{/IsSub}</w:t>
             </w:r>
           </w:p>
           <w:p>

</xml_diff>

<commit_message>
feat(bwt): Einleitungszeile, Pos-Nummern und Totals im Angebot korrigiert
- Zeile "Liefern und Montieren der nachfolgend aufgefuehrten
  Badewannentuer" erscheint bei BWT direkt unter "Auszufuehrende
  Arbeiten" (erste PrimaryServiceLine, kein Bullet).
- Doppelte Position 002 behoben: die BWT-Sonderfaelle, die die
  Bonus-Positionen auf 002/003 gesetzt haben, sind entfernt. 002 ist
  im Template fest als Materialposition vergeben, Bonuszeilen starten
  jetzt wie ueberall bei 003/004.
- Zeile "Gesamtsumme nach Zuschuss § 40 SGB XI - Ihr Eigenanteil"
  wird bei BWT nicht mehr ausgegeben (andere Bereiche unveraendert).
- Angebot.docx: Abstand zwischen den Positionsbloecken.
- Verwaister LibreOffice-Lockfile .~lock.Angebot.docx# entfernt.

Co-Authored-By: Claude <noreply@anthropic.com>
</commit_message>
<xml_diff>
--- a/src/templates/Angebot.docx
+++ b/src/templates/Angebot.docx
@@ -63,9 +63,9 @@
         <w:tblLook w:val="04a0" w:noVBand="1" w:noHBand="0" w:lastColumn="0" w:firstColumn="1" w:lastRow="0" w:firstRow="1"/>
       </w:tblPr>
       <w:tblGrid>
-        <w:gridCol w:w="4807"/>
+        <w:gridCol w:w="4806"/>
         <w:gridCol w:w="2268"/>
-        <w:gridCol w:w="2960"/>
+        <w:gridCol w:w="2961"/>
       </w:tblGrid>
       <w:tr>
         <w:trPr>
@@ -73,7 +73,7 @@
         </w:trPr>
         <w:tc>
           <w:tcPr>
-            <w:tcW w:w="4807" w:type="dxa"/>
+            <w:tcW w:w="4806" w:type="dxa"/>
             <w:tcBorders>
               <w:top w:val="single" w:sz="8" w:space="0" w:color="FFFFFF"/>
               <w:left w:val="single" w:sz="8" w:space="0" w:color="FFFFFF"/>
@@ -291,7 +291,7 @@
         </w:tc>
         <w:tc>
           <w:tcPr>
-            <w:tcW w:w="2960" w:type="dxa"/>
+            <w:tcW w:w="2961" w:type="dxa"/>
             <w:tcBorders>
               <w:top w:val="single" w:sz="8" w:space="0" w:color="FFFFFF"/>
               <w:left w:val="single" w:sz="8" w:space="0" w:color="FFFFFF"/>
@@ -484,7 +484,7 @@
         </w:trPr>
         <w:tc>
           <w:tcPr>
-            <w:tcW w:w="4807" w:type="dxa"/>
+            <w:tcW w:w="4806" w:type="dxa"/>
             <w:tcBorders>
               <w:top w:val="single" w:sz="8" w:space="0" w:color="FFFFFF"/>
               <w:left w:val="single" w:sz="8" w:space="0" w:color="FFFFFF"/>
@@ -519,7 +519,7 @@
         </w:tc>
         <w:tc>
           <w:tcPr>
-            <w:tcW w:w="5228" w:type="dxa"/>
+            <w:tcW w:w="5229" w:type="dxa"/>
             <w:gridSpan w:val="2"/>
             <w:tcBorders>
               <w:top w:val="single" w:sz="8" w:space="0" w:color="FFFFFF"/>
@@ -733,9 +733,9 @@
       <w:tblGrid>
         <w:gridCol w:w="510"/>
         <w:gridCol w:w="885"/>
-        <w:gridCol w:w="5863"/>
+        <w:gridCol w:w="5862"/>
         <w:gridCol w:w="1440"/>
-        <w:gridCol w:w="1247"/>
+        <w:gridCol w:w="1248"/>
       </w:tblGrid>
       <w:tr>
         <w:trPr>
@@ -809,7 +809,7 @@
         </w:tc>
         <w:tc>
           <w:tcPr>
-            <w:tcW w:w="5863" w:type="dxa"/>
+            <w:tcW w:w="5862" w:type="dxa"/>
             <w:tcBorders/>
             <w:shd w:color="auto" w:fill="CCCCCC" w:val="clear"/>
           </w:tcPr>
@@ -868,7 +868,7 @@
         </w:tc>
         <w:tc>
           <w:tcPr>
-            <w:tcW w:w="1247" w:type="dxa"/>
+            <w:tcW w:w="1248" w:type="dxa"/>
             <w:tcBorders/>
             <w:shd w:color="auto" w:fill="CCCCCC" w:val="clear"/>
           </w:tcPr>
@@ -963,7 +963,7 @@
         </w:tc>
         <w:tc>
           <w:tcPr>
-            <w:tcW w:w="5863" w:type="dxa"/>
+            <w:tcW w:w="5862" w:type="dxa"/>
             <w:tcBorders/>
             <w:shd w:color="auto" w:fill="FFFFFF" w:val="clear"/>
           </w:tcPr>
@@ -1027,7 +1027,7 @@
         </w:tc>
         <w:tc>
           <w:tcPr>
-            <w:tcW w:w="1247" w:type="dxa"/>
+            <w:tcW w:w="1248" w:type="dxa"/>
             <w:tcBorders/>
             <w:shd w:color="auto" w:fill="FFFFFF" w:val="clear"/>
           </w:tcPr>
@@ -1145,7 +1145,7 @@
         </w:tc>
         <w:tc>
           <w:tcPr>
-            <w:tcW w:w="5863" w:type="dxa"/>
+            <w:tcW w:w="5862" w:type="dxa"/>
             <w:tcBorders/>
             <w:shd w:color="auto" w:fill="FFFFFF" w:val="clear"/>
             <w:tcMar>
@@ -1433,7 +1433,7 @@
         </w:tc>
         <w:tc>
           <w:tcPr>
-            <w:tcW w:w="1247" w:type="dxa"/>
+            <w:tcW w:w="1248" w:type="dxa"/>
             <w:tcBorders/>
             <w:shd w:color="auto" w:fill="FFFFFF" w:val="clear"/>
             <w:tcMar>
@@ -1507,9 +1507,9 @@
       <w:tblGrid>
         <w:gridCol w:w="510"/>
         <w:gridCol w:w="885"/>
-        <w:gridCol w:w="5863"/>
+        <w:gridCol w:w="5862"/>
         <w:gridCol w:w="1440"/>
-        <w:gridCol w:w="1247"/>
+        <w:gridCol w:w="1248"/>
       </w:tblGrid>
       <w:tr>
         <w:trPr>
@@ -1578,7 +1578,7 @@
         </w:tc>
         <w:tc>
           <w:tcPr>
-            <w:tcW w:w="5863" w:type="dxa"/>
+            <w:tcW w:w="5862" w:type="dxa"/>
             <w:tcBorders/>
             <w:shd w:color="auto" w:fill="FFFFFF" w:val="clear"/>
           </w:tcPr>
@@ -1649,7 +1649,7 @@
         </w:tc>
         <w:tc>
           <w:tcPr>
-            <w:tcW w:w="1247" w:type="dxa"/>
+            <w:tcW w:w="1248" w:type="dxa"/>
             <w:tcBorders/>
             <w:shd w:color="auto" w:fill="FFFFFF" w:val="clear"/>
             <w:tcMar>
@@ -1738,7 +1738,7 @@
         </w:tc>
         <w:tc>
           <w:tcPr>
-            <w:tcW w:w="5863" w:type="dxa"/>
+            <w:tcW w:w="5862" w:type="dxa"/>
             <w:tcBorders/>
             <w:shd w:color="auto" w:fill="FFFFFF" w:val="clear"/>
           </w:tcPr>
@@ -1768,8 +1768,13 @@
             </w:r>
           </w:p>
           <w:p>
-            <w:r>
-              <w:t xml:space="preserve">{#IsSub}</w:t>
+            <w:pPr>
+              <w:pStyle w:val="Normal"/>
+              <w:rPr/>
+            </w:pPr>
+            <w:r>
+              <w:rPr/>
+              <w:t>{#IsSub}</w:t>
             </w:r>
           </w:p>
           <w:p>
@@ -1779,9 +1784,9 @@
               <w:spacing w:lineRule="auto" w:line="278" w:before="120" w:after="0"/>
               <w:jc w:val="left"/>
               <w:rPr>
+                <w:rFonts w:ascii="Arial" w:hAnsi="Arial" w:eastAsia="Arial" w:cs="Arial"/>
                 <w:b/>
                 <w:bCs/>
-                <w:rFonts w:ascii="Arial" w:hAnsi="Arial" w:eastAsia="Arial" w:cs="Arial"/>
                 <w:color w:val="000000"/>
                 <w:sz w:val="20"/>
                 <w:szCs w:val="20"/>
@@ -1789,9 +1794,9 @@
             </w:pPr>
             <w:r>
               <w:rPr>
+                <w:rFonts w:eastAsia="Arial" w:cs="Arial" w:ascii="Arial" w:hAnsi="Arial"/>
                 <w:b/>
                 <w:bCs/>
-                <w:rFonts w:eastAsia="Arial" w:cs="Arial" w:ascii="Arial" w:hAnsi="Arial"/>
                 <w:color w:val="000000"/>
                 <w:kern w:val="0"/>
                 <w:sz w:val="20"/>
@@ -1802,13 +1807,23 @@
             </w:r>
           </w:p>
           <w:p>
-            <w:r>
-              <w:t xml:space="preserve">{/IsSub}</w:t>
-            </w:r>
-          </w:p>
-          <w:p>
-            <w:r>
-              <w:t xml:space="preserve">{^IsSub}</w:t>
+            <w:pPr>
+              <w:pStyle w:val="Normal"/>
+              <w:rPr/>
+            </w:pPr>
+            <w:r>
+              <w:rPr/>
+              <w:t>{/IsSub}</w:t>
+            </w:r>
+          </w:p>
+          <w:p>
+            <w:pPr>
+              <w:pStyle w:val="Normal"/>
+              <w:rPr/>
+            </w:pPr>
+            <w:r>
+              <w:rPr/>
+              <w:t>{^IsSub}</w:t>
             </w:r>
           </w:p>
           <w:p>
@@ -1837,8 +1852,13 @@
             </w:r>
           </w:p>
           <w:p>
-            <w:r>
-              <w:t xml:space="preserve">{/IsSub}</w:t>
+            <w:pPr>
+              <w:pStyle w:val="Normal"/>
+              <w:rPr/>
+            </w:pPr>
+            <w:r>
+              <w:rPr/>
+              <w:t>{/IsSub}</w:t>
             </w:r>
           </w:p>
           <w:p>
@@ -1895,7 +1915,7 @@
         </w:tc>
         <w:tc>
           <w:tcPr>
-            <w:tcW w:w="1247" w:type="dxa"/>
+            <w:tcW w:w="1248" w:type="dxa"/>
             <w:tcBorders/>
             <w:shd w:color="auto" w:fill="FFFFFF" w:val="clear"/>
             <w:vAlign w:val="center"/>
@@ -1935,15 +1955,10 @@
             <w:pPr>
               <w:pStyle w:val="Normal"/>
               <w:suppressAutoHyphens w:val="true"/>
-              <w:spacing w:lineRule="auto" w:line="278" w:before="0" w:after="0"/>
+              <w:spacing w:lineRule="auto" w:line="278" w:before="115" w:after="0"/>
               <w:ind w:right="-26"/>
               <w:jc w:val="center"/>
-              <w:rPr>
-                <w:rFonts w:ascii="Arial" w:hAnsi="Arial" w:eastAsia="Arial" w:cs="Arial"/>
-                <w:color w:val="000000"/>
-                <w:sz w:val="18"/>
-                <w:szCs w:val="18"/>
-              </w:rPr>
+              <w:rPr/>
             </w:pPr>
             <w:r>
               <w:rPr>
@@ -1968,14 +1983,9 @@
             <w:pPr>
               <w:pStyle w:val="Normal"/>
               <w:suppressAutoHyphens w:val="true"/>
-              <w:spacing w:lineRule="auto" w:line="278" w:before="0" w:after="0"/>
+              <w:spacing w:lineRule="auto" w:line="278" w:before="115" w:after="0"/>
               <w:jc w:val="center"/>
-              <w:rPr>
-                <w:rFonts w:ascii="Arial" w:hAnsi="Arial" w:eastAsia="Arial" w:cs="Arial"/>
-                <w:color w:val="000000"/>
-                <w:sz w:val="18"/>
-                <w:szCs w:val="18"/>
-              </w:rPr>
+              <w:rPr/>
             </w:pPr>
             <w:r>
               <w:rPr>
@@ -1992,7 +2002,7 @@
         </w:tc>
         <w:tc>
           <w:tcPr>
-            <w:tcW w:w="5863" w:type="dxa"/>
+            <w:tcW w:w="5862" w:type="dxa"/>
             <w:tcBorders/>
             <w:shd w:color="auto" w:fill="FFFFFF" w:val="clear"/>
           </w:tcPr>
@@ -2000,16 +2010,9 @@
             <w:pPr>
               <w:pStyle w:val="Normal"/>
               <w:suppressAutoHyphens w:val="true"/>
-              <w:spacing w:lineRule="auto" w:line="278" w:before="0" w:after="0"/>
+              <w:spacing w:lineRule="auto" w:line="278" w:before="115" w:after="0"/>
               <w:jc w:val="left"/>
-              <w:rPr>
-                <w:rFonts w:ascii="Arial" w:hAnsi="Arial" w:eastAsia="Arial" w:cs="Arial"/>
-                <w:b/>
-                <w:bCs/>
-                <w:color w:val="000000"/>
-                <w:sz w:val="20"/>
-                <w:szCs w:val="20"/>
-              </w:rPr>
+              <w:rPr/>
             </w:pPr>
             <w:r>
               <w:rPr>
@@ -2029,14 +2032,9 @@
             <w:pPr>
               <w:pStyle w:val="Normal"/>
               <w:suppressAutoHyphens w:val="true"/>
-              <w:spacing w:lineRule="auto" w:line="278" w:before="0" w:after="0"/>
+              <w:spacing w:lineRule="auto" w:line="278" w:before="115" w:after="0"/>
               <w:jc w:val="left"/>
-              <w:rPr>
-                <w:rFonts w:ascii="Arial" w:hAnsi="Arial" w:eastAsia="Arial" w:cs="Arial"/>
-                <w:color w:val="000000"/>
-                <w:sz w:val="20"/>
-                <w:szCs w:val="18"/>
-              </w:rPr>
+              <w:rPr/>
             </w:pPr>
             <w:r>
               <w:rPr>
@@ -2061,12 +2059,9 @@
             <w:pPr>
               <w:pStyle w:val="Normal"/>
               <w:suppressAutoHyphens w:val="true"/>
-              <w:spacing w:lineRule="auto" w:line="278" w:before="0" w:after="0"/>
+              <w:spacing w:lineRule="auto" w:line="278" w:before="115" w:after="0"/>
               <w:jc w:val="center"/>
-              <w:rPr>
-                <w:rFonts w:ascii="Arial" w:hAnsi="Arial" w:eastAsia="Arial" w:cs="Arial"/>
-                <w:color w:val="000000"/>
-              </w:rPr>
+              <w:rPr/>
             </w:pPr>
             <w:r>
               <w:rPr>
@@ -2083,7 +2078,7 @@
         </w:tc>
         <w:tc>
           <w:tcPr>
-            <w:tcW w:w="1247" w:type="dxa"/>
+            <w:tcW w:w="1248" w:type="dxa"/>
             <w:tcBorders/>
             <w:shd w:color="auto" w:fill="FFFFFF" w:val="clear"/>
           </w:tcPr>
@@ -2091,12 +2086,9 @@
             <w:pPr>
               <w:pStyle w:val="Normal"/>
               <w:suppressAutoHyphens w:val="true"/>
-              <w:spacing w:lineRule="auto" w:line="278" w:before="0" w:after="0"/>
+              <w:spacing w:lineRule="auto" w:line="278" w:before="115" w:after="0"/>
               <w:jc w:val="center"/>
-              <w:rPr>
-                <w:rFonts w:ascii="Arial" w:hAnsi="Arial" w:eastAsia="Arial" w:cs="Arial"/>
-                <w:color w:val="000000"/>
-              </w:rPr>
+              <w:rPr/>
             </w:pPr>
             <w:r>
               <w:rPr>
@@ -3013,8 +3005,8 @@
       <w:tblLook w:val="04a0" w:noVBand="1" w:noHBand="0" w:lastColumn="0" w:firstColumn="1" w:lastRow="0" w:firstRow="1"/>
     </w:tblPr>
     <w:tblGrid>
-      <w:gridCol w:w="8056"/>
-      <w:gridCol w:w="1828"/>
+      <w:gridCol w:w="8057"/>
+      <w:gridCol w:w="1827"/>
     </w:tblGrid>
     <w:tr>
       <w:trPr>
@@ -3022,7 +3014,7 @@
       </w:trPr>
       <w:tc>
         <w:tcPr>
-          <w:tcW w:w="8056" w:type="dxa"/>
+          <w:tcW w:w="8057" w:type="dxa"/>
           <w:tcBorders>
             <w:top w:val="single" w:sz="8" w:space="0" w:color="FFFFFF"/>
             <w:left w:val="single" w:sz="8" w:space="0" w:color="FFFFFF"/>
@@ -3109,7 +3101,7 @@
       </w:tc>
       <w:tc>
         <w:tcPr>
-          <w:tcW w:w="1828" w:type="dxa"/>
+          <w:tcW w:w="1827" w:type="dxa"/>
           <w:tcBorders>
             <w:top w:val="single" w:sz="8" w:space="0" w:color="FFFFFF"/>
             <w:left w:val="single" w:sz="8" w:space="0" w:color="FFFFFF"/>
@@ -3304,8 +3296,8 @@
       <w:tblLook w:val="04a0" w:noVBand="1" w:noHBand="0" w:lastColumn="0" w:firstColumn="1" w:lastRow="0" w:firstRow="1"/>
     </w:tblPr>
     <w:tblGrid>
-      <w:gridCol w:w="8056"/>
-      <w:gridCol w:w="1828"/>
+      <w:gridCol w:w="8057"/>
+      <w:gridCol w:w="1827"/>
     </w:tblGrid>
     <w:tr>
       <w:trPr>
@@ -3313,7 +3305,7 @@
       </w:trPr>
       <w:tc>
         <w:tcPr>
-          <w:tcW w:w="8056" w:type="dxa"/>
+          <w:tcW w:w="8057" w:type="dxa"/>
           <w:tcBorders>
             <w:top w:val="single" w:sz="8" w:space="0" w:color="FFFFFF"/>
             <w:left w:val="single" w:sz="8" w:space="0" w:color="FFFFFF"/>
@@ -3400,7 +3392,7 @@
       </w:tc>
       <w:tc>
         <w:tcPr>
-          <w:tcW w:w="1828" w:type="dxa"/>
+          <w:tcW w:w="1827" w:type="dxa"/>
           <w:tcBorders>
             <w:top w:val="single" w:sz="8" w:space="0" w:color="FFFFFF"/>
             <w:left w:val="single" w:sz="8" w:space="0" w:color="FFFFFF"/>

</xml_diff>